<commit_message>
refactor: extract Gold Service into a shared component
Pulled the dark-box premium-tier section out of /home into
src/components/GoldService.astro and embedded it on both /home
and /services/hourly-mediation. Restored the gold wordmark that
stays visible while cream prose fades in around it. Hourly-
mediation CTA background flipped to cream-warm so the cream
alternation still holds with the new section in the middle.

Also picks up newer Engagement Agreement files and a stray
unused image cleanup.
</commit_message>
<xml_diff>
--- a/public/Pro_Se_Fair_Play_Engagement_Agreement.docx
+++ b/public/Pro_Se_Fair_Play_Engagement_Agreement.docx
@@ -300,139 +300,234 @@
         <w:t>Pro Se Fair Play Mediation LLC is not a law firm. We are not attorneys and do not provide legal advice or legal representation. We provide mediation and document preparation services for self-represented individuals only.</w:t>
       </w:r>
     </w:p>
-    <w:tbl>
-      <w:tblPr>
-        <w:tblStyle w:val="TableGrid"/>
-        <w:tblW w:w="0" w:type="auto"/>
-        <w:tblLook w:val="04A0" w:firstRow="1" w:lastRow="0" w:firstColumn="1" w:lastColumn="0" w:noHBand="0" w:noVBand="1"/>
-      </w:tblPr>
-      <w:tblGrid>
-        <w:gridCol w:w="4824"/>
-        <w:gridCol w:w="4824"/>
-      </w:tblGrid>
-      <w:tr>
-        <w:tc>
-          <w:tcPr>
-            <w:tcW w:w="4824" w:type="dxa"/>
-          </w:tcPr>
-          <w:p>
-            <w:r>
-              <w:t>Client Name</w:t>
-            </w:r>
-          </w:p>
-        </w:tc>
-        <w:tc>
-          <w:tcPr>
-            <w:tcW w:w="4824" w:type="dxa"/>
-          </w:tcPr>
-          <w:p/>
-        </w:tc>
-      </w:tr>
-      <w:tr>
-        <w:tc>
-          <w:tcPr>
-            <w:tcW w:w="4824" w:type="dxa"/>
-          </w:tcPr>
-          <w:p>
-            <w:r>
-              <w:t>Client Signature</w:t>
-            </w:r>
-          </w:p>
-        </w:tc>
-        <w:tc>
-          <w:tcPr>
-            <w:tcW w:w="4824" w:type="dxa"/>
-          </w:tcPr>
-          <w:p/>
-        </w:tc>
-      </w:tr>
-      <w:tr>
-        <w:tc>
-          <w:tcPr>
-            <w:tcW w:w="4824" w:type="dxa"/>
-          </w:tcPr>
-          <w:p>
-            <w:r>
-              <w:t>Date</w:t>
-            </w:r>
-          </w:p>
-        </w:tc>
-        <w:tc>
-          <w:tcPr>
-            <w:tcW w:w="4824" w:type="dxa"/>
-          </w:tcPr>
-          <w:p/>
-        </w:tc>
-      </w:tr>
-      <w:tr>
-        <w:tc>
-          <w:tcPr>
-            <w:tcW w:w="4824" w:type="dxa"/>
-          </w:tcPr>
-          <w:p>
-            <w:r>
-              <w:t>Second Client Signature (If Applicable)</w:t>
-            </w:r>
-          </w:p>
-        </w:tc>
-        <w:tc>
-          <w:tcPr>
-            <w:tcW w:w="4824" w:type="dxa"/>
-          </w:tcPr>
-          <w:p/>
-        </w:tc>
-      </w:tr>
-      <w:tr>
-        <w:tc>
-          <w:tcPr>
-            <w:tcW w:w="4824" w:type="dxa"/>
-          </w:tcPr>
-          <w:p>
-            <w:r>
-              <w:t>Date</w:t>
-            </w:r>
-          </w:p>
-        </w:tc>
-        <w:tc>
-          <w:tcPr>
-            <w:tcW w:w="4824" w:type="dxa"/>
-          </w:tcPr>
-          <w:p/>
-        </w:tc>
-      </w:tr>
-      <w:tr>
-        <w:tc>
-          <w:tcPr>
-            <w:tcW w:w="4824" w:type="dxa"/>
-          </w:tcPr>
-          <w:p>
-            <w:r>
-              <w:t>Authorized Representative</w:t>
-            </w:r>
-          </w:p>
-        </w:tc>
-        <w:tc>
-          <w:tcPr>
-            <w:tcW w:w="4824" w:type="dxa"/>
-          </w:tcPr>
-          <w:p>
-            <w:r>
-              <w:t>Marie VanGinHoven</w:t>
-            </w:r>
-          </w:p>
-        </w:tc>
-      </w:tr>
-    </w:tbl>
     <w:p>
       <w:pPr>
         <w:jc w:val="center"/>
+        <w:rPr>
+          <w:b/>
+          <w:sz w:val="20"/>
+          <w:u w:val="single"/>
+        </w:rPr>
       </w:pPr>
       <w:r>
         <w:rPr>
           <w:b/>
           <w:sz w:val="20"/>
         </w:rPr>
-        <w:t>Prepared for Professional Client Use</w:t>
+        <w:t>Authorized Representative:</w:t>
+      </w:r>
+      <w:r>
+        <w:rPr>
+          <w:b/>
+          <w:sz w:val="20"/>
+          <w:u w:val="single"/>
+        </w:rPr>
+        <w:t xml:space="preserve"> </w:t>
+      </w:r>
+      <w:r>
+        <w:rPr>
+          <w:b/>
+          <w:sz w:val="20"/>
+          <w:u w:val="single"/>
+        </w:rPr>
+        <w:t xml:space="preserve">  Marie </w:t>
+      </w:r>
+      <w:proofErr w:type="spellStart"/>
+      <w:r>
+        <w:rPr>
+          <w:b/>
+          <w:sz w:val="20"/>
+          <w:u w:val="single"/>
+        </w:rPr>
+        <w:t>VanGinHoven</w:t>
+      </w:r>
+      <w:proofErr w:type="spellEnd"/>
+      <w:r>
+        <w:rPr>
+          <w:b/>
+          <w:sz w:val="20"/>
+          <w:u w:val="single"/>
+        </w:rPr>
+        <w:t xml:space="preserve"> _ </w:t>
+      </w:r>
+    </w:p>
+    <w:p>
+      <w:pPr>
+        <w:rPr>
+          <w:b/>
+          <w:sz w:val="20"/>
+        </w:rPr>
+      </w:pPr>
+      <w:r>
+        <w:rPr>
+          <w:b/>
+          <w:sz w:val="20"/>
+        </w:rPr>
+        <w:t xml:space="preserve">Client Name:        </w:t>
+      </w:r>
+      <w:r>
+        <w:rPr>
+          <w:b/>
+          <w:sz w:val="20"/>
+          <w:u w:val="single"/>
+        </w:rPr>
+        <w:t>________________________</w:t>
+      </w:r>
+      <w:r>
+        <w:rPr>
+          <w:b/>
+          <w:sz w:val="20"/>
+        </w:rPr>
+        <w:tab/>
+        <w:t>2</w:t>
+      </w:r>
+      <w:r>
+        <w:rPr>
+          <w:b/>
+          <w:sz w:val="20"/>
+          <w:vertAlign w:val="superscript"/>
+        </w:rPr>
+        <w:t xml:space="preserve">nd </w:t>
+      </w:r>
+      <w:r>
+        <w:rPr>
+          <w:b/>
+          <w:sz w:val="20"/>
+        </w:rPr>
+        <w:t xml:space="preserve">Client Name (if applicable):       </w:t>
+      </w:r>
+      <w:r>
+        <w:rPr>
+          <w:b/>
+          <w:sz w:val="20"/>
+          <w:u w:val="single"/>
+        </w:rPr>
+        <w:t xml:space="preserve"> ______________________</w:t>
+      </w:r>
+    </w:p>
+    <w:p>
+      <w:pPr>
+        <w:rPr>
+          <w:b/>
+          <w:sz w:val="20"/>
+        </w:rPr>
+      </w:pPr>
+      <w:r>
+        <w:rPr>
+          <w:b/>
+          <w:sz w:val="20"/>
+        </w:rPr>
+        <w:t xml:space="preserve">Client Signature: </w:t>
+      </w:r>
+      <w:r>
+        <w:rPr>
+          <w:b/>
+          <w:sz w:val="20"/>
+          <w:u w:val="single"/>
+        </w:rPr>
+        <w:t>________________________</w:t>
+      </w:r>
+      <w:r>
+        <w:rPr>
+          <w:b/>
+          <w:sz w:val="20"/>
+          <w:u w:val="single"/>
+        </w:rPr>
+        <w:t xml:space="preserve"> </w:t>
+      </w:r>
+      <w:r>
+        <w:rPr>
+          <w:b/>
+          <w:sz w:val="20"/>
+        </w:rPr>
+        <w:tab/>
+        <w:t>2</w:t>
+      </w:r>
+      <w:r>
+        <w:rPr>
+          <w:b/>
+          <w:sz w:val="20"/>
+          <w:vertAlign w:val="superscript"/>
+        </w:rPr>
+        <w:t>nd</w:t>
+      </w:r>
+      <w:r>
+        <w:rPr>
+          <w:b/>
+          <w:sz w:val="20"/>
+        </w:rPr>
+        <w:t xml:space="preserve"> Client Signature (if applicable):</w:t>
+      </w:r>
+      <w:r>
+        <w:rPr>
+          <w:b/>
+          <w:sz w:val="20"/>
+          <w:u w:val="single"/>
+        </w:rPr>
+        <w:t xml:space="preserve"> ______________________</w:t>
+      </w:r>
+    </w:p>
+    <w:p>
+      <w:pPr>
+        <w:tabs>
+          <w:tab w:val="right" w:pos="9648"/>
+        </w:tabs>
+        <w:rPr>
+          <w:b/>
+          <w:sz w:val="20"/>
+        </w:rPr>
+      </w:pPr>
+      <w:r>
+        <w:rPr>
+          <w:b/>
+          <w:sz w:val="20"/>
+        </w:rPr>
+        <w:t xml:space="preserve">Date:                     </w:t>
+      </w:r>
+      <w:r>
+        <w:rPr>
+          <w:b/>
+          <w:sz w:val="20"/>
+          <w:u w:val="single"/>
+        </w:rPr>
+        <w:t>________________________</w:t>
+      </w:r>
+      <w:r>
+        <w:rPr>
+          <w:b/>
+          <w:sz w:val="20"/>
+          <w:u w:val="single"/>
+        </w:rPr>
+        <w:t xml:space="preserve"> </w:t>
+      </w:r>
+      <w:r>
+        <w:rPr>
+          <w:b/>
+          <w:sz w:val="20"/>
+        </w:rPr>
+        <w:t xml:space="preserve">       Date:                                                </w:t>
+      </w:r>
+      <w:r>
+        <w:rPr>
+          <w:b/>
+          <w:sz w:val="20"/>
+        </w:rPr>
+        <w:t xml:space="preserve"> </w:t>
+      </w:r>
+      <w:r>
+        <w:rPr>
+          <w:b/>
+          <w:sz w:val="20"/>
+        </w:rPr>
+        <w:t xml:space="preserve">  </w:t>
+      </w:r>
+      <w:r>
+        <w:rPr>
+          <w:b/>
+          <w:sz w:val="20"/>
+          <w:u w:val="single"/>
+        </w:rPr>
+        <w:t xml:space="preserve"> ______________________</w:t>
       </w:r>
     </w:p>
     <w:sectPr>

</xml_diff>

<commit_message>
chore: minor update to engagement agreement (docx + pdf)
</commit_message>
<xml_diff>
--- a/public/Pro_Se_Fair_Play_Engagement_Agreement.docx
+++ b/public/Pro_Se_Fair_Play_Engagement_Agreement.docx
@@ -153,6 +153,9 @@
       </w:r>
     </w:p>
     <w:p>
+      <w:pPr>
+        <w:spacing w:line="240" w:lineRule="auto"/>
+      </w:pPr>
       <w:r>
         <w:rPr>
           <w:b/>
@@ -162,6 +165,9 @@
       </w:r>
     </w:p>
     <w:p>
+      <w:pPr>
+        <w:spacing w:line="240" w:lineRule="auto"/>
+      </w:pPr>
       <w:r>
         <w:t>Pro Se Fair Play Mediation LLC provides mediation, neutral facilitation, family mediation, high-conflict dispute facilitation, document preparation services for self-represented individuals, administrative support services, parenting plan drafting assistance based solely upon client-provided information, court form preparation services, and scheduling assistance.</w:t>
       </w:r>
@@ -174,21 +180,46 @@
       </w:r>
     </w:p>
     <w:p>
+      <w:pPr>
+        <w:rPr>
+          <w:b/>
+          <w:sz w:val="26"/>
+        </w:rPr>
+      </w:pPr>
+    </w:p>
+    <w:p>
+      <w:pPr>
+        <w:rPr>
+          <w:b/>
+          <w:sz w:val="26"/>
+        </w:rPr>
+      </w:pPr>
+    </w:p>
+    <w:p>
+      <w:pPr>
+        <w:spacing w:line="240" w:lineRule="auto"/>
+      </w:pPr>
       <w:r>
         <w:rPr>
           <w:b/>
           <w:sz w:val="26"/>
         </w:rPr>
+        <w:lastRenderedPageBreak/>
         <w:t>2. NO ATTORNEY-CLIENT RELATIONSHIP</w:t>
       </w:r>
     </w:p>
     <w:p>
+      <w:pPr>
+        <w:spacing w:line="240" w:lineRule="auto"/>
+      </w:pPr>
       <w:r>
-        <w:lastRenderedPageBreak/>
         <w:t>No attorney-client relationship is created by this Agreement. Clients are encouraged to seek independent legal counsel regarding their legal rights and obligations.</w:t>
       </w:r>
     </w:p>
     <w:p>
+      <w:pPr>
+        <w:spacing w:line="240" w:lineRule="auto"/>
+      </w:pPr>
       <w:r>
         <w:rPr>
           <w:b/>
@@ -198,11 +229,17 @@
       </w:r>
     </w:p>
     <w:p>
+      <w:pPr>
+        <w:spacing w:line="240" w:lineRule="auto"/>
+      </w:pPr>
       <w:r>
         <w:t>The mediator acts solely as a neutral facilitator and does not advocate for either party. No guarantees regarding settlement or outcomes are made.</w:t>
       </w:r>
     </w:p>
     <w:p>
+      <w:pPr>
+        <w:spacing w:line="240" w:lineRule="auto"/>
+      </w:pPr>
       <w:r>
         <w:rPr>
           <w:b/>
@@ -212,11 +249,17 @@
       </w:r>
     </w:p>
     <w:p>
+      <w:pPr>
+        <w:spacing w:line="240" w:lineRule="auto"/>
+      </w:pPr>
       <w:r>
         <w:t>To the fullest extent permitted under Florida law, mediation communications shall remain confidential pursuant to Chapter 44, Florida Statutes, and applicable Florida mediation rules.</w:t>
       </w:r>
     </w:p>
     <w:p>
+      <w:pPr>
+        <w:spacing w:line="240" w:lineRule="auto"/>
+      </w:pPr>
       <w:r>
         <w:rPr>
           <w:b/>
@@ -226,11 +269,17 @@
       </w:r>
     </w:p>
     <w:p>
+      <w:pPr>
+        <w:spacing w:line="240" w:lineRule="auto"/>
+      </w:pPr>
       <w:r>
         <w:t>The Company acts solely as a scrivener and administrative preparer. All information inserted into forms or documents is supplied by the Client.</w:t>
       </w:r>
     </w:p>
     <w:p>
+      <w:pPr>
+        <w:spacing w:line="240" w:lineRule="auto"/>
+      </w:pPr>
       <w:r>
         <w:rPr>
           <w:b/>
@@ -240,11 +289,17 @@
       </w:r>
     </w:p>
     <w:p>
+      <w:pPr>
+        <w:spacing w:line="240" w:lineRule="auto"/>
+      </w:pPr>
       <w:r>
         <w:t>All fees are earned upon commencement of services unless otherwise agreed in writing. Additional charges may apply for rush services, revisions, administrative support, or rescheduled sessions.</w:t>
       </w:r>
     </w:p>
     <w:p>
+      <w:pPr>
+        <w:spacing w:line="240" w:lineRule="auto"/>
+      </w:pPr>
       <w:r>
         <w:rPr>
           <w:b/>
@@ -254,11 +309,17 @@
       </w:r>
     </w:p>
     <w:p>
+      <w:pPr>
+        <w:spacing w:line="240" w:lineRule="auto"/>
+      </w:pPr>
       <w:r>
         <w:t>The Company makes no guarantees regarding mediation outcomes, judicial rulings, settlement terms, or litigation results.</w:t>
       </w:r>
     </w:p>
     <w:p>
+      <w:pPr>
+        <w:spacing w:line="240" w:lineRule="auto"/>
+      </w:pPr>
       <w:r>
         <w:rPr>
           <w:b/>
@@ -268,11 +329,17 @@
       </w:r>
     </w:p>
     <w:p>
+      <w:pPr>
+        <w:spacing w:line="240" w:lineRule="auto"/>
+      </w:pPr>
       <w:r>
         <w:t>To the fullest extent permitted by law, the Company’s total liability shall not exceed the amount actually paid by Client for services rendered.</w:t>
       </w:r>
     </w:p>
     <w:p>
+      <w:pPr>
+        <w:spacing w:line="240" w:lineRule="auto"/>
+      </w:pPr>
       <w:r>
         <w:rPr>
           <w:b/>
@@ -282,11 +349,17 @@
       </w:r>
     </w:p>
     <w:p>
+      <w:pPr>
+        <w:spacing w:line="240" w:lineRule="auto"/>
+      </w:pPr>
       <w:r>
         <w:t>Any dispute arising under this Agreement shall first be submitted to mediation in Palm Beach County, Florida. Florida law shall govern this Agreement.</w:t>
       </w:r>
     </w:p>
     <w:p>
+      <w:pPr>
+        <w:spacing w:line="240" w:lineRule="auto"/>
+      </w:pPr>
       <w:r>
         <w:rPr>
           <w:b/>
@@ -296,9 +369,17 @@
       </w:r>
     </w:p>
     <w:p>
+      <w:pPr>
+        <w:spacing w:line="240" w:lineRule="auto"/>
+      </w:pPr>
       <w:r>
         <w:t>Pro Se Fair Play Mediation LLC is not a law firm. We are not attorneys and do not provide legal advice or legal representation. We provide mediation and document preparation services for self-represented individuals only.</w:t>
       </w:r>
+    </w:p>
+    <w:p>
+      <w:pPr>
+        <w:spacing w:line="240" w:lineRule="auto"/>
+      </w:pPr>
     </w:p>
     <w:p>
       <w:pPr>

</xml_diff>

<commit_message>
fix: swap business phone to local (561) 941-0896
Replace the old 1-866-88-FORPROSE vanity number with (561) 941-0896
across the contact and landing pages, JSON-LD telephone schema, the
HTML + text + PDF/Word engagement agreements, and docs. Collapse the
contact card's vanity-plus-digits two-line display into one number.
</commit_message>
<xml_diff>
--- a/public/Pro_Se_Fair_Play_Engagement_Agreement.docx
+++ b/public/Pro_Se_Fair_Play_Engagement_Agreement.docx
@@ -112,7 +112,12 @@
           <w:sz w:val="20"/>
         </w:rPr>
         <w:br/>
-        <w:t>1-866-88-FORPROSE</w:t>
+      </w:r>
+      <w:r>
+        <w:rPr>
+          <w:sz w:val="20"/>
+        </w:rPr>
+        <w:t>(561) 941-0896</w:t>
       </w:r>
       <w:r>
         <w:rPr>
@@ -413,7 +418,6 @@
         </w:rPr>
         <w:t xml:space="preserve">  Marie </w:t>
       </w:r>
-      <w:proofErr w:type="spellStart"/>
       <w:r>
         <w:rPr>
           <w:b/>
@@ -422,7 +426,6 @@
         </w:rPr>
         <w:t>VanGinHoven</w:t>
       </w:r>
-      <w:proofErr w:type="spellEnd"/>
       <w:r>
         <w:rPr>
           <w:b/>

</xml_diff>